<commit_message>
fix: align Ella Credits with published pricing
Charge 1 credit per CV analysis and 10 credits per AI phone interview, ignoring stale cost overrides. Update credit displays and ledger pricing, improve the balance form layout, and simplify Settings to show only important operational controls. Include the updated URS documents and PDF generation option.
</commit_message>
<xml_diff>
--- a/docs/USER-REQUIREMENTS-STUDY.docx
+++ b/docs/USER-REQUIREMENTS-STUDY.docx
@@ -667,6 +667,14 @@
     </w:p>
     <w:p>
       <w:pPr>
+        <w:pStyle w:val="Normal"/>
+      </w:pPr>
+      <w:r>
+        <w:t xml:space="preserve">All mandatory recruitment-setup fields, screening criteria, interview questions, prompts, and evaluation instructions shall be reviewed and validated for discriminatory, exclusionary, or otherwise unlawful language before they can be published or used by an AI workflow. The system shall identify and block criteria based on protected or irrelevant personal characteristics, including age, gender, race, ethnicity, nationality, religion, disability, medical history, family status, appearance, accent, location, or economic background, unless a lawful, documented, job-related exception has been approved through the required legal or compliance process.</w:t>
+      </w:r>
+    </w:p>
+    <w:p>
+      <w:pPr>
         <w:pStyle w:val="Heading3"/>
       </w:pPr>
       <w:r>
@@ -699,6 +707,14 @@
     </w:p>
     <w:p>
       <w:pPr>
+        <w:pStyle w:val="Normal"/>
+      </w:pPr>
+      <w:r>
+        <w:t xml:space="preserve">AI screening prompts, criteria, mandatory fields, scoring rubrics, and output fields shall not contain language or rules that directly or indirectly discriminate against candidates. Screening shall use only consistent, job-related evidence and shall not request, infer, score, or rely on protected characteristics or proxies for protected characteristics. The system shall reject or flag discriminatory instructions before an AI screening workflow is executed, and HR shall be able to review the criteria and evidence supporting each result.</w:t>
+      </w:r>
+    </w:p>
+    <w:p>
+      <w:pPr>
         <w:pStyle w:val="Heading3"/>
       </w:pPr>
       <w:r>
@@ -726,7 +742,15 @@
         <w:pStyle w:val="Quote"/>
       </w:pPr>
       <w:r>
-        <w:t xml:space="preserve">AI Interview Notice: This interview will be conducted with the assistance of an AI interviewing system, which may record, transcribe and assess your responses against job-related criteria. Any information or responses generated by the AI should not be considered an official representation, commitment or offer by Mclink Group unless confirmed in writing by an authorized representative.</w:t>
+        <w:t xml:space="preserve">AI Interview Notice: This interview will be conducted with the assistance of an AI interviewing system, which may record, transcribe and assess your responses against job-related criteria. Any information or responses generated, transcribed, summarized, or communicated by the AI may be inaccurate, incomplete, misleading, or inconsistent with the candidate's actual statements or qualifications. AI output is not verified and must not be relied upon as an official statement, representation, commitment, promise, or offer by McLink Group. The candidate remains responsible for the accuracy of information submitted or communicated and must not misrepresent their identity, qualifications, experience, or responses. McLink Group does not accept responsibility for decisions or actions based on unverified AI output, and only an authorized McLink Group representative may make or confirm an official employment-related statement or offer in writing.</w:t>
+      </w:r>
+    </w:p>
+    <w:p>
+      <w:pPr>
+        <w:pStyle w:val="Normal"/>
+      </w:pPr>
+      <w:r>
+        <w:t xml:space="preserve">The same disclaimer shall be communicated clearly at the start of every AI phone interview and, where technically supported, repeated before the call ends. The disclaimer shall explain that AI-generated questions, transcripts, summaries, and assessments may contain errors or hallucinations, and that they do not create any representation, commitment, promise, or offer on behalf of McLink Group.</w:t>
       </w:r>
     </w:p>
     <w:p>
@@ -763,6 +787,14 @@
     </w:p>
     <w:p>
       <w:pPr>
+        <w:pStyle w:val="Normal"/>
+      </w:pPr>
+      <w:r>
+        <w:t xml:space="preserve">AI phone interviews shall use only approved, job-related questions and evaluation criteria and shall not solicit or infer discriminatory information. The system shall preserve the disclaimer presented to the candidate and shall clearly identify AI-generated questions, transcripts, summaries, and results as unverified decision-support content. No AI phone-interview output shall be treated as an official statement or employment commitment by McLink Group, and all consequential decisions shall remain subject to authorized human review.</w:t>
+      </w:r>
+    </w:p>
+    <w:p>
+      <w:pPr>
         <w:pStyle w:val="Heading3"/>
       </w:pPr>
       <w:r>
@@ -1174,7 +1206,7 @@
         <w:pStyle w:val="Normal"/>
       </w:pPr>
       <w:r>
-        <w:t xml:space="preserve">   without paraphrasing or omission.</w:t>
+        <w:t xml:space="preserve">   without paraphrasing or omission, and the AI phone interview communicates the    approved disclaimer at the required points.</w:t>
       </w:r>
     </w:p>
     <w:p>
@@ -1207,6 +1239,22 @@
       </w:pPr>
       <w:r>
         <w:t xml:space="preserve">   human decision.</w:t>
+      </w:r>
+    </w:p>
+    <w:p>
+      <w:pPr>
+        <w:pStyle w:val="ListNumber"/>
+      </w:pPr>
+      <w:r>
+        <w:t xml:space="preserve">Mandatory recruitment fields, screening criteria, prompts, interview</w:t>
+      </w:r>
+    </w:p>
+    <w:p>
+      <w:pPr>
+        <w:pStyle w:val="Normal"/>
+      </w:pPr>
+      <w:r>
+        <w:t xml:space="preserve">   questions, and evaluation fields are blocked or flagged when they contain    discriminatory or irrelevant criteria.</w:t>
       </w:r>
     </w:p>
     <w:p>

</xml_diff>